<commit_message>
Informe y presentacion: profesora guia Ana Rosa Moya Beltran y nota de uso autorizado de IA
Co-Authored-By: Claude Sonnet 5.5 <noreply@anthropic.com>
</commit_message>
<xml_diff>
--- a/docs/informe_titulo2/Informe_Titulo_II_Avance_2026-10-22.docx
+++ b/docs/informe_titulo2/Informe_Titulo_II_Avance_2026-10-22.docx
@@ -167,7 +167,7 @@
                 <w:sz w:val="21"/>
                 <w:szCs w:val="21"/>
               </w:rPr>
-              <w:t xml:space="preserve">PROFESOR GUÍA</w:t>
+              <w:t xml:space="preserve">PROFESORA GUÍA</w:t>
             </w:r>
           </w:p>
           <w:p>
@@ -179,35 +179,7 @@
                 <w:sz w:val="21"/>
                 <w:szCs w:val="21"/>
               </w:rPr>
-              <w:t xml:space="preserve">Juan Pablo Argerstein</w:t>
-            </w:r>
-          </w:p>
-          <w:p>
-            <w:pPr>
-              <w:spacing w:after="40"/>
-            </w:pPr>
-            <w:r>
-              <w:rPr>
-                <w:i/>
-                <w:iCs/>
-                <w:color w:val="5A6B9C"/>
-                <w:sz w:val="21"/>
-                <w:szCs w:val="21"/>
-              </w:rPr>
-              <w:t xml:space="preserve">Master Computer Science / Senior Cloud Data Engineer</w:t>
-            </w:r>
-          </w:p>
-          <w:p>
-            <w:pPr>
-              <w:spacing w:after="40"/>
-            </w:pPr>
-            <w:r>
-              <w:rPr>
-                <w:color w:val="5A6B9C"/>
-                <w:sz w:val="21"/>
-                <w:szCs w:val="21"/>
-              </w:rPr>
-              <w:t xml:space="preserve">jangerstein@utem.cl</w:t>
+              <w:t xml:space="preserve">Ana Rosa Moya Beltrán</w:t>
             </w:r>
           </w:p>
         </w:tc>
@@ -6214,7 +6186,7 @@
         <w:spacing w:after="120" w:line="276"/>
         <w:jc w:val="left"/>
       </w:pPr>
-      <w:hyperlink w:history="1" r:id="rIdmabplqok7hb0tmyax0ikv">
+      <w:hyperlink w:history="1" r:id="rIdg_cqpfdbltxpnlwpi5clr">
         <w:r>
           <w:rPr>
             <w:color w:val="0563C1"/>
@@ -6324,7 +6296,7 @@
         <w:spacing w:after="120" w:line="276"/>
         <w:jc w:val="left"/>
       </w:pPr>
-      <w:hyperlink w:history="1" r:id="rIdaupwar-hzzijdvtmuhth2">
+      <w:hyperlink w:history="1" r:id="rIdmjkf-m0yby8isd3kjh1ru">
         <w:r>
           <w:rPr>
             <w:color w:val="0563C1"/>
@@ -6348,7 +6320,7 @@
         <w:spacing w:after="120" w:line="276"/>
         <w:jc w:val="left"/>
       </w:pPr>
-      <w:hyperlink w:history="1" r:id="rIdsucuaj2uffdwaxciqfofi">
+      <w:hyperlink w:history="1" r:id="rIdadjufemst-dcqimypfewd">
         <w:r>
           <w:rPr>
             <w:color w:val="0563C1"/>
@@ -6389,7 +6361,7 @@
         <w:spacing w:after="120" w:line="276"/>
         <w:jc w:val="left"/>
       </w:pPr>
-      <w:hyperlink w:history="1" r:id="rIdz4irb6k7uldx5tfo_t0kb">
+      <w:hyperlink w:history="1" r:id="rIdv5q3kuzexxkrjwirmgqtg">
         <w:r>
           <w:rPr>
             <w:color w:val="0563C1"/>
@@ -6439,7 +6411,7 @@
         <w:spacing w:after="120" w:line="276"/>
         <w:jc w:val="left"/>
       </w:pPr>
-      <w:hyperlink w:history="1" r:id="rIdadj_amus-j1pwnakqylyc">
+      <w:hyperlink w:history="1" r:id="rIdfpumn18uah_rejrchheiq">
         <w:r>
           <w:rPr>
             <w:color w:val="0563C1"/>
@@ -6480,7 +6452,7 @@
         <w:spacing w:after="120" w:line="276"/>
         <w:jc w:val="left"/>
       </w:pPr>
-      <w:hyperlink w:history="1" r:id="rId1hmk0sn74h4tocarokgeo">
+      <w:hyperlink w:history="1" r:id="rIdrt1ykvud9cuboviwlekgj">
         <w:r>
           <w:rPr>
             <w:color w:val="0563C1"/>
@@ -6598,7 +6570,7 @@
         <w:spacing w:after="120" w:line="276"/>
         <w:jc w:val="left"/>
       </w:pPr>
-      <w:hyperlink w:history="1" r:id="rIdbeqa5wo8bea6mff_avkuq">
+      <w:hyperlink w:history="1" r:id="rIdm5vbhuzqbooqaoze5a9q7">
         <w:r>
           <w:rPr>
             <w:color w:val="0563C1"/>
@@ -6648,7 +6620,7 @@
         <w:spacing w:after="120" w:line="276"/>
         <w:jc w:val="left"/>
       </w:pPr>
-      <w:hyperlink w:history="1" r:id="rIdbh3o4taxzmun5ealgqjoq">
+      <w:hyperlink w:history="1" r:id="rIddoe19zjubke2-wst-lwbz">
         <w:r>
           <w:rPr>
             <w:color w:val="0563C1"/>
@@ -11611,7 +11583,7 @@
         </w:rPr>
         <w:t xml:space="preserve">Glosten, L. R., &amp; Milgrom, P. R. (1985). Bid, ask and transaction prices in a specialist market with heterogeneously informed traders. Journal of Financial Economics, 14(1), 71–100.</w:t>
       </w:r>
-      <w:hyperlink w:history="1" r:id="rIdiua9qs-t2uy5_otwnb5p_">
+      <w:hyperlink w:history="1" r:id="rIdpeczys7cxx74svywpkqvz">
         <w:r>
           <w:rPr>
             <w:i/>
@@ -11622,7 +11594,7 @@
           <w:t xml:space="preserve"> </w:t>
         </w:r>
       </w:hyperlink>
-      <w:hyperlink w:history="1" r:id="rIdaamstpxgf9exslljkflvi">
+      <w:hyperlink w:history="1" r:id="rIdzhokdh1-yyws_ovw-ls4s">
         <w:r>
           <w:rPr>
             <w:i/>
@@ -11646,7 +11618,7 @@
         </w:rPr>
         <w:t xml:space="preserve">Gould, M. D., Porter, M. A., Williams, S., McDonald, M., Fenn, D. J., &amp; Howison, S. D. (2013). Limit order books. Quantitative Finance, 13(11), 1709–1741.</w:t>
       </w:r>
-      <w:hyperlink w:history="1" r:id="rId3ewdzuis8pfr_4oynlb-2">
+      <w:hyperlink w:history="1" r:id="rIdfvqp3s2aaemenhhlsgush">
         <w:r>
           <w:rPr>
             <w:i/>
@@ -11657,7 +11629,7 @@
           <w:t xml:space="preserve"> </w:t>
         </w:r>
       </w:hyperlink>
-      <w:hyperlink w:history="1" r:id="rId8pzkdgpasmcwbz6mwr10v">
+      <w:hyperlink w:history="1" r:id="rIdo5c-_j2rwqflwqduy5ikr">
         <w:r>
           <w:rPr>
             <w:i/>
@@ -11681,7 +11653,7 @@
         </w:rPr>
         <w:t xml:space="preserve">Hasbrouck, J. (1991). Measuring the information content of stock trades. Journal of Finance, 46(1), 179–207.</w:t>
       </w:r>
-      <w:hyperlink w:history="1" r:id="rIdun5idpnbqw5pbc2ky66lx">
+      <w:hyperlink w:history="1" r:id="rIdepjlov64l-bpbeyzjzack">
         <w:r>
           <w:rPr>
             <w:i/>
@@ -11692,7 +11664,7 @@
           <w:t xml:space="preserve"> </w:t>
         </w:r>
       </w:hyperlink>
-      <w:hyperlink w:history="1" r:id="rIdez4yk38kknto6arzovyto">
+      <w:hyperlink w:history="1" r:id="rIdgwfnhf1kcx1kuvvuexirw">
         <w:r>
           <w:rPr>
             <w:i/>
@@ -11716,7 +11688,7 @@
         </w:rPr>
         <w:t xml:space="preserve">Kyle, A. S. (1985). Continuous auctions and insider trading. Econometrica, 53(6), 1315–1335.</w:t>
       </w:r>
-      <w:hyperlink w:history="1" r:id="rIdo-gtrfh_f4im6ivvvu2in">
+      <w:hyperlink w:history="1" r:id="rIdlvt7oevbvm5hz6jh5c1xr">
         <w:r>
           <w:rPr>
             <w:i/>
@@ -11727,7 +11699,7 @@
           <w:t xml:space="preserve"> </w:t>
         </w:r>
       </w:hyperlink>
-      <w:hyperlink w:history="1" r:id="rIdkouxuipsn-6dg6ymlnv9x">
+      <w:hyperlink w:history="1" r:id="rIdnbcq0moft8vsmjozhsbyw">
         <w:r>
           <w:rPr>
             <w:i/>
@@ -11751,7 +11723,7 @@
         </w:rPr>
         <w:t xml:space="preserve">Parlour, C. A. (1998). Price dynamics in limit order markets. The Review of Financial Studies, 11(4), 789–816.</w:t>
       </w:r>
-      <w:hyperlink w:history="1" r:id="rIdfk0tgv9bp_iehpwe8sbhe">
+      <w:hyperlink w:history="1" r:id="rId6bhlxonkht8xam_tgrssv">
         <w:r>
           <w:rPr>
             <w:i/>
@@ -11762,7 +11734,7 @@
           <w:t xml:space="preserve"> </w:t>
         </w:r>
       </w:hyperlink>
-      <w:hyperlink w:history="1" r:id="rIdcuo6nb4bssywzuqg1qjqw">
+      <w:hyperlink w:history="1" r:id="rIdnpvry_eeucfz2wwvw6jrq">
         <w:r>
           <w:rPr>
             <w:i/>
@@ -11786,7 +11758,7 @@
         </w:rPr>
         <w:t xml:space="preserve">Rocsu, I. (2009). A dynamic model of the limit order book. The Review of Financial Studies, 22(11), 4601–4641.</w:t>
       </w:r>
-      <w:hyperlink w:history="1" r:id="rIdze8xosxlgyeganoyfursa">
+      <w:hyperlink w:history="1" r:id="rIdqt1g1r45-kdolnyvhtbq0">
         <w:r>
           <w:rPr>
             <w:i/>
@@ -11797,7 +11769,7 @@
           <w:t xml:space="preserve"> </w:t>
         </w:r>
       </w:hyperlink>
-      <w:hyperlink w:history="1" r:id="rIdqch23guzaratb94gqleoy">
+      <w:hyperlink w:history="1" r:id="rIdd3x5xx4pchhm_gax3wyhm">
         <w:r>
           <w:rPr>
             <w:i/>
@@ -11836,7 +11808,7 @@
         </w:rPr>
         <w:t xml:space="preserve">Almgren, R., &amp; Chriss, N. (2001). Optimal execution of portfolio transactions. Journal of Risk, 3(2), 5–39.</w:t>
       </w:r>
-      <w:hyperlink w:history="1" r:id="rId9bhubu4x-m_teo_6vucnn">
+      <w:hyperlink w:history="1" r:id="rIdkrswntiezsqcw2ypaq8lk">
         <w:r>
           <w:rPr>
             <w:i/>
@@ -11847,7 +11819,7 @@
           <w:t xml:space="preserve"> </w:t>
         </w:r>
       </w:hyperlink>
-      <w:hyperlink w:history="1" r:id="rIdmet9icfo23c9mo4wf0ult">
+      <w:hyperlink w:history="1" r:id="rId9yqufrep8dxzqw6c2hivo">
         <w:r>
           <w:rPr>
             <w:i/>
@@ -11871,7 +11843,7 @@
         </w:rPr>
         <w:t xml:space="preserve">Almgren, R. F. (2003). Optimal execution with nonlinear impact functions and trading-enhanced risk. Applied Mathematical Finance, 10(1), 1–18.</w:t>
       </w:r>
-      <w:hyperlink w:history="1" r:id="rIdo5ou3tqk55cfe4rozjkrc">
+      <w:hyperlink w:history="1" r:id="rIdjnkleqvuvnp1mvgevnylt">
         <w:r>
           <w:rPr>
             <w:i/>
@@ -11882,7 +11854,7 @@
           <w:t xml:space="preserve"> </w:t>
         </w:r>
       </w:hyperlink>
-      <w:hyperlink w:history="1" r:id="rIdrfxtlpabgvugomhanfa3y">
+      <w:hyperlink w:history="1" r:id="rId2gv_3ypyv-1jzdidf_eq5">
         <w:r>
           <w:rPr>
             <w:i/>
@@ -11906,7 +11878,7 @@
         </w:rPr>
         <w:t xml:space="preserve">Kato, T. (2016). Optimality of VWAP execution strategies under general shaped market impact functions. arXiv:1605.03683.</w:t>
       </w:r>
-      <w:hyperlink w:history="1" r:id="rIdr4ehuk7tvrhahpisp8opp">
+      <w:hyperlink w:history="1" r:id="rIdoniowanbvs36mz0nc-c_z">
         <w:r>
           <w:rPr>
             <w:i/>
@@ -11917,7 +11889,7 @@
           <w:t xml:space="preserve"> </w:t>
         </w:r>
       </w:hyperlink>
-      <w:hyperlink w:history="1" r:id="rIde1wb2q_a2eujqwpc8e5wb">
+      <w:hyperlink w:history="1" r:id="rIdcbaaq9su0ybiqkju4mclr">
         <w:r>
           <w:rPr>
             <w:i/>
@@ -11941,7 +11913,7 @@
         </w:rPr>
         <w:t xml:space="preserve">Perold, A. F. (1988). The implementation shortfall: Paper versus reality. Journal of Portfolio Management, 14(3), 4–9.</w:t>
       </w:r>
-      <w:hyperlink w:history="1" r:id="rIdw51usku76zgu6uphfb6yw">
+      <w:hyperlink w:history="1" r:id="rIdrwjbj4ox-tk2qdyyhtqp1">
         <w:r>
           <w:rPr>
             <w:i/>
@@ -11952,7 +11924,7 @@
           <w:t xml:space="preserve"> </w:t>
         </w:r>
       </w:hyperlink>
-      <w:hyperlink w:history="1" r:id="rIde1k-eu3n6selsvidv8n-k">
+      <w:hyperlink w:history="1" r:id="rIdxu8nvqa5dzcc-_lvtskho">
         <w:r>
           <w:rPr>
             <w:i/>
@@ -11991,7 +11963,7 @@
         </w:rPr>
         <w:t xml:space="preserve">Kolm, P. N., &amp; Ritter, G. (2019). Dynamic replication and hedging: A reinforcement learning approach. Journal of Financial Data Science, 1(1), 159–171.</w:t>
       </w:r>
-      <w:hyperlink w:history="1" r:id="rIdb-nrivkxlqrykmb-crudz">
+      <w:hyperlink w:history="1" r:id="rIdf67fobpgwnycu5wul4y7n">
         <w:r>
           <w:rPr>
             <w:i/>
@@ -12002,7 +11974,7 @@
           <w:t xml:space="preserve"> </w:t>
         </w:r>
       </w:hyperlink>
-      <w:hyperlink w:history="1" r:id="rIdoldzkgxkgtx-iby8ngmvt">
+      <w:hyperlink w:history="1" r:id="rIdyrw6ouwxj41lxmgtoyzyv">
         <w:r>
           <w:rPr>
             <w:i/>
@@ -12039,7 +12011,7 @@
         </w:rPr>
         <w:t xml:space="preserve">Nevmyvaka, Y., Feng, Y., &amp; Kearns, M. (2006). Reinforcement learning for optimized trade execution. En Proceedings of the 23rd International Conference on Machine Learning (pp. 673–680). ACM.</w:t>
       </w:r>
-      <w:hyperlink w:history="1" r:id="rId_cg7qgura8dfy0pfzm3ec">
+      <w:hyperlink w:history="1" r:id="rIdy3gakmihy5p1hvf-wmzxq">
         <w:r>
           <w:rPr>
             <w:i/>
@@ -12050,7 +12022,7 @@
           <w:t xml:space="preserve"> </w:t>
         </w:r>
       </w:hyperlink>
-      <w:hyperlink w:history="1" r:id="rIdxqccreiq-csa9xsry_byl">
+      <w:hyperlink w:history="1" r:id="rIdzevmcspbiqj9lupnzkyyg">
         <w:r>
           <w:rPr>
             <w:i/>
@@ -12074,7 +12046,7 @@
         </w:rPr>
         <w:t xml:space="preserve">Ning, B., Lin, F. H., &amp; Jaimungal, S. (2021). Double deep Q-learning for optimal execution. Applied Mathematical Finance, 28(2), 98–124.</w:t>
       </w:r>
-      <w:hyperlink w:history="1" r:id="rIdb3ffwsyesmivmdjvvblpe">
+      <w:hyperlink w:history="1" r:id="rIdq5ihwpozmshxzq4j-qgkw">
         <w:r>
           <w:rPr>
             <w:i/>
@@ -12085,7 +12057,7 @@
           <w:t xml:space="preserve"> </w:t>
         </w:r>
       </w:hyperlink>
-      <w:hyperlink w:history="1" r:id="rIdxvh6yilcnsz2af_j2is5_">
+      <w:hyperlink w:history="1" r:id="rIdslpl88y2tncto-_yqwaif">
         <w:r>
           <w:rPr>
             <w:i/>
@@ -12109,7 +12081,7 @@
         </w:rPr>
         <w:t xml:space="preserve">Schulman, J., Wolski, F., Dhariwal, P., Radford, A., &amp; Klimov, O. (2017). Proximal policy optimization algorithms. arXiv:1707.06347.</w:t>
       </w:r>
-      <w:hyperlink w:history="1" r:id="rId3sped8o3pxn6nfuly67xf">
+      <w:hyperlink w:history="1" r:id="rIdyalyoqktduzrgt46shwib">
         <w:r>
           <w:rPr>
             <w:i/>
@@ -12120,7 +12092,7 @@
           <w:t xml:space="preserve"> </w:t>
         </w:r>
       </w:hyperlink>
-      <w:hyperlink w:history="1" r:id="rIdh0dxb02qjeylaxssbvkjw">
+      <w:hyperlink w:history="1" r:id="rIdjse8nb0o2xevbrb5p7vzp">
         <w:r>
           <w:rPr>
             <w:i/>
@@ -12159,7 +12131,7 @@
         </w:rPr>
         <w:t xml:space="preserve">Lowe, R., Wu, Y., Tamar, A., Harb, J., Abbeel, P., &amp; Mordatch, I. (2017). Multi-agent actor-critic for mixed cooperative-competitive environments. En Advances in Neural Information Processing Systems (Vol. 30, pp. 6379–6390). Curran Associates. </w:t>
       </w:r>
-      <w:hyperlink w:history="1" r:id="rIdbbzix7qmxnnmvadxxyqzc">
+      <w:hyperlink w:history="1" r:id="rIdizbt4adfndl29byj38d0z">
         <w:r>
           <w:rPr>
             <w:i/>
@@ -12190,7 +12162,7 @@
         </w:rPr>
         <w:t xml:space="preserve">Rashid, T., Samvelyan, M., de Witt, C. S., Farquhar, G., Foerster, J., &amp; Whiteson, S. (2018). QMIX: Monotonic value function factorisation for deep multi-agent reinforcement learning. En Proceedings of the 35th International Conference on Machine Learning (pp. 4295–4304). PMLR. </w:t>
       </w:r>
-      <w:hyperlink w:history="1" r:id="rIdzuf-w-npktywkyn5uvfx3">
+      <w:hyperlink w:history="1" r:id="rId8aqsfuwzqfcdfqii4anme">
         <w:r>
           <w:rPr>
             <w:i/>
@@ -12236,7 +12208,7 @@
         </w:rPr>
         <w:t xml:space="preserve">Arenas, M., &amp; Busta, C. (2022). Determinantes de la liquidez bursátil en Chile: Análisis del IPSA 2010–2022. Revista de Análisis Económico, 37(2), 45–78.</w:t>
       </w:r>
-      <w:hyperlink w:history="1" r:id="rIdlzwcacerjfkj0gz5u4sne">
+      <w:hyperlink w:history="1" r:id="rId8cajkboyuaj_c8y3e6bbj">
         <w:r>
           <w:rPr>
             <w:i/>
@@ -12247,7 +12219,7 @@
           <w:t xml:space="preserve"> </w:t>
         </w:r>
       </w:hyperlink>
-      <w:hyperlink w:history="1" r:id="rIdm6unybzv3vyu4oqkc3vhh">
+      <w:hyperlink w:history="1" r:id="rIdwm8a_5ryn3okltnbfy8-t">
         <w:r>
           <w:rPr>
             <w:i/>
@@ -12271,7 +12243,7 @@
         </w:rPr>
         <w:t xml:space="preserve">Bolsa de Santiago. (2024). Manual de Operaciones en Acciones. Bolsa de Comercio de Santiago.</w:t>
       </w:r>
-      <w:hyperlink w:history="1" r:id="rIdulv9kxrtyxuyyn315vbol">
+      <w:hyperlink w:history="1" r:id="rIdxcppqxcmdkp_mfzjpowqh">
         <w:r>
           <w:rPr>
             <w:i/>
@@ -12282,7 +12254,7 @@
           <w:t xml:space="preserve"> </w:t>
         </w:r>
       </w:hyperlink>
-      <w:hyperlink w:history="1" r:id="rIdx8okcxgdx-w2cya9jaaly">
+      <w:hyperlink w:history="1" r:id="rIds0djclycevxxiro4zzulw">
         <w:r>
           <w:rPr>
             <w:i/>
@@ -12306,7 +12278,7 @@
         </w:rPr>
         <w:t xml:space="preserve">Comisión para el Mercado Financiero (CMF). (2024). Ley N° 18.045 de Mercado de Valores. CMF Chile.</w:t>
       </w:r>
-      <w:hyperlink w:history="1" r:id="rIdlxyok22xc1pkav1nmztqq">
+      <w:hyperlink w:history="1" r:id="rIdldaogqt8snihp-2ymjrip">
         <w:r>
           <w:rPr>
             <w:i/>
@@ -12317,7 +12289,7 @@
           <w:t xml:space="preserve"> </w:t>
         </w:r>
       </w:hyperlink>
-      <w:hyperlink w:history="1" r:id="rIdzebhvxswvhaiuv01m4ohm">
+      <w:hyperlink w:history="1" r:id="rIdobmnipq0x6jsk1gfe5rm_">
         <w:r>
           <w:rPr>
             <w:i/>
@@ -12341,7 +12313,7 @@
         </w:rPr>
         <w:t xml:space="preserve">Silva, T., &amp; Durán, G. (2023). Gobernanza corporativa y eficiencia del mercado accionario chileno. Estudios de Administración, 30(1), 12–34.</w:t>
       </w:r>
-      <w:hyperlink w:history="1" r:id="rIdlwoirhwi6ue1vq6c4mo-c">
+      <w:hyperlink w:history="1" r:id="rIdzuzxigllrbbng4ruoz99q">
         <w:r>
           <w:rPr>
             <w:i/>
@@ -12352,7 +12324,7 @@
           <w:t xml:space="preserve"> </w:t>
         </w:r>
       </w:hyperlink>
-      <w:hyperlink w:history="1" r:id="rIdmjljftnwzx_ddt1zjjqof">
+      <w:hyperlink w:history="1" r:id="rIdk8zyyabytq0nf8s-gdz-n">
         <w:r>
           <w:rPr>
             <w:i/>
@@ -12391,7 +12363,7 @@
         </w:rPr>
         <w:t xml:space="preserve">Byrd, D., Hybinette, M., &amp; Balch, T. H. (2020). ABIDES: Towards high-fidelity market simulation for AI research. En Proceedings of the 1st ACM International Conference on AI in Finance (Article 19). ACM. </w:t>
       </w:r>
-      <w:hyperlink w:history="1" r:id="rIdfryjateqotxzq7wlbgux7">
+      <w:hyperlink w:history="1" r:id="rIdhabyyepybqjntrzgllvn1">
         <w:r>
           <w:rPr>
             <w:i/>
@@ -12422,7 +12394,7 @@
         </w:rPr>
         <w:t xml:space="preserve">França, L., &amp; Jaimungal, S. (2022). mbt_gym: Reinforcement learning for model-based limit order book trading. arXiv preprint arXiv:2209.15042. </w:t>
       </w:r>
-      <w:hyperlink w:history="1" r:id="rIdz0zicnxt-9v9pt1qga86j">
+      <w:hyperlink w:history="1" r:id="rIdi4hu0ua7ceh2yudpuv3xh">
         <w:r>
           <w:rPr>
             <w:i/>
@@ -12485,7 +12457,7 @@
         </w:rPr>
         <w:t xml:space="preserve">Gould, M. D., Porter, M. A., Williams, S., McDonald, M., Fenn, D. J., &amp; Howison, S. D. (2013). Limit order books. Quantitative Finance, 13(11), 1709–1741. </w:t>
       </w:r>
-      <w:hyperlink w:history="1" r:id="rIdija_qorecfj5yg8dn_n3l">
+      <w:hyperlink w:history="1" r:id="rIdqcjlxll0qzrqxqkdk4a0d">
         <w:r>
           <w:rPr>
             <w:i/>
@@ -44315,7 +44287,7 @@
         <w:jc w:val="both"/>
       </w:pPr>
       <w:r>
-        <w:t xml:space="preserve">El equipo utilizó Claude Code (Anthropic) como asistente de programación, análisis y redacción. Los documentos del repositorio lo declaran en su encabezado y quedan sujetos a la revisión de quien corresponde; las cifras de este informe provienen de archivos versionados en el repositorio y se contrastaron contra ellos antes de entregar.</w:t>
+        <w:t xml:space="preserve">El equipo utilizó Claude Code (Anthropic) como asistente de programación, análisis y redacción, con la autorización de la universidad para el uso de herramientas de inteligencia artificial en el desarrollo del proyecto y en este informe. Los documentos del repositorio lo declaran en su encabezado y quedan sujetos a la revisión de quien corresponde; las cifras de este informe provienen de archivos versionados en el repositorio y se contrastaron contra ellos antes de entregar.</w:t>
       </w:r>
     </w:p>
     <w:p>

</xml_diff>